<commit_message>
Fix syntax errors, update media links and reset logic
</commit_message>
<xml_diff>
--- a/4_웹앱구현명세서.docx
+++ b/4_웹앱구현명세서.docx
@@ -1356,7 +1356,7 @@
                 <w:sz w:val="20"/>
                 <w:szCs w:val="20"/>
               </w:rPr>
-              <w:t xml:space="preserve">개인 디자인</w:t>
+              <w:t xml:space="preserve">QR 조각찾기</w:t>
             </w:r>
           </w:p>
         </w:tc>
@@ -1382,7 +1382,7 @@
                 <w:sz w:val="20"/>
                 <w:szCs w:val="20"/>
               </w:rPr>
-              <w:t xml:space="preserve">직급별 개인 화면(이름 입력 없음) → 디자인 요소·TPO·5R 선택 → 이유 서술</w:t>
+              <w:t xml:space="preserve">QR 스캔 → 부서 자동 인식 → 부서 이름 입력 → 조각 잠금 해제</w:t>
             </w:r>
           </w:p>
         </w:tc>
@@ -1438,7 +1438,7 @@
                 <w:sz w:val="20"/>
                 <w:szCs w:val="20"/>
               </w:rPr>
-              <w:t xml:space="preserve">소감</w:t>
+              <w:t xml:space="preserve">개인 디자인</w:t>
             </w:r>
           </w:p>
         </w:tc>
@@ -1465,7 +1465,7 @@
                 <w:sz w:val="20"/>
                 <w:szCs w:val="20"/>
               </w:rPr>
-              <w:t xml:space="preserve">개인 소감 2문항 입력·제출</w:t>
+              <w:t xml:space="preserve">직급별 개인 화면(이름 입력 없음) → 그림 업로드 → 디자인 요소·TPO·5R 선택 → 이유 서술</w:t>
             </w:r>
           </w:p>
         </w:tc>
@@ -1519,7 +1519,7 @@
                 <w:sz w:val="20"/>
                 <w:szCs w:val="20"/>
               </w:rPr>
-              <w:t xml:space="preserve">결과</w:t>
+              <w:t xml:space="preserve">소감</w:t>
             </w:r>
           </w:p>
         </w:tc>
@@ -1545,7 +1545,7 @@
                 <w:sz w:val="20"/>
                 <w:szCs w:val="20"/>
               </w:rPr>
-              <w:t xml:space="preserve">팀 총점, 학급 환경 게이지 결과 메시지</w:t>
+              <w:t xml:space="preserve">개인 소감 2문항 입력·제출</w:t>
             </w:r>
           </w:p>
         </w:tc>
@@ -1574,7 +1574,7 @@
                 <w:sz w:val="20"/>
                 <w:szCs w:val="20"/>
               </w:rPr>
-              <w:t xml:space="preserve">D</w:t>
+              <w:t xml:space="preserve">9</w:t>
             </w:r>
           </w:p>
         </w:tc>
@@ -1601,7 +1601,7 @@
                 <w:sz w:val="20"/>
                 <w:szCs w:val="20"/>
               </w:rPr>
-              <w:t xml:space="preserve">교사용 대시보드</w:t>
+              <w:t xml:space="preserve">결과</w:t>
             </w:r>
           </w:p>
         </w:tc>
@@ -1628,7 +1628,87 @@
                 <w:sz w:val="20"/>
                 <w:szCs w:val="20"/>
               </w:rPr>
-              <w:t xml:space="preserve">전체 팀 진행 트랙 + 학급 환경 게이지 (별도 URL, 전자칠판 표출)</w:t>
+              <w:t xml:space="preserve">팀 총점, 학급 환경 게이지 결과</w:t>
+            </w:r>
+          </w:p>
+        </w:tc>
+      </w:tr>
+      <w:tr>
+        <w:tc>
+          <w:tcPr>
+            <w:tcW w:type="dxa" w:w="1000"/>
+            <w:tcMar>
+              <w:top w:type="dxa" w:w="100"/>
+              <w:left w:type="dxa" w:w="120"/>
+              <w:bottom w:type="dxa" w:w="100"/>
+              <w:right w:type="dxa" w:w="120"/>
+            </w:tcMar>
+            <w:vAlign w:val="center"/>
+          </w:tcPr>
+          <w:p>
+            <w:pPr>
+              <w:jc w:val="left"/>
+            </w:pPr>
+            <w:r>
+              <w:rPr>
+                <w:b w:val="false"/>
+                <w:bCs w:val="false"/>
+                <w:sz w:val="20"/>
+                <w:szCs w:val="20"/>
+              </w:rPr>
+              <w:t xml:space="preserve">D</w:t>
+            </w:r>
+          </w:p>
+        </w:tc>
+        <w:tc>
+          <w:tcPr>
+            <w:tcW w:type="dxa" w:w="2600"/>
+            <w:tcMar>
+              <w:top w:type="dxa" w:w="100"/>
+              <w:left w:type="dxa" w:w="120"/>
+              <w:bottom w:type="dxa" w:w="100"/>
+              <w:right w:type="dxa" w:w="120"/>
+            </w:tcMar>
+            <w:vAlign w:val="center"/>
+          </w:tcPr>
+          <w:p>
+            <w:pPr>
+              <w:jc w:val="left"/>
+            </w:pPr>
+            <w:r>
+              <w:rPr>
+                <w:b w:val="false"/>
+                <w:bCs w:val="false"/>
+                <w:sz w:val="20"/>
+                <w:szCs w:val="20"/>
+              </w:rPr>
+              <w:t xml:space="preserve">교사용 대시보드</w:t>
+            </w:r>
+          </w:p>
+        </w:tc>
+        <w:tc>
+          <w:tcPr>
+            <w:tcW w:type="dxa" w:w="5426"/>
+            <w:tcMar>
+              <w:top w:type="dxa" w:w="100"/>
+              <w:left w:type="dxa" w:w="120"/>
+              <w:bottom w:type="dxa" w:w="100"/>
+              <w:right w:type="dxa" w:w="120"/>
+            </w:tcMar>
+            <w:vAlign w:val="center"/>
+          </w:tcPr>
+          <w:p>
+            <w:pPr>
+              <w:jc w:val="left"/>
+            </w:pPr>
+            <w:r>
+              <w:rPr>
+                <w:b w:val="false"/>
+                <w:bCs w:val="false"/>
+                <w:sz w:val="20"/>
+                <w:szCs w:val="20"/>
+              </w:rPr>
+              <w:t xml:space="preserve">전체 부서 진행 트랙 + 세로줄무늬 조각 슬롯(완성 시 이미지 페이드인) + 학급 환경 게이지 (별도 URL, 전자칠판 표출)</w:t>
             </w:r>
           </w:p>
         </w:tc>
@@ -2097,7 +2177,7 @@
         <w:spacing w:after="150" w:before="300"/>
       </w:pPr>
       <w:r>
-        <w:t xml:space="preserve">4-5. 제출·개인 화면</w:t>
+        <w:t xml:space="preserve">4-5. 제출 화면</w:t>
       </w:r>
     </w:p>
     <w:p>
@@ -2114,7 +2194,16 @@
           <w:sz w:val="21"/>
           <w:szCs w:val="21"/>
         </w:rPr>
-        <w:t xml:space="preserve">인벤토리 슬롯 3칸에 원단 조각 아이콘이 채워진 모습 확인 → 팀 발표 메모 작성 → 제출</w:t>
+        <w:t xml:space="preserve">인벤토리 슬롯 3칸에 원단 조각 아이콘이 채워진 모습 확인 → 팀 발표 메모 작성 → 제출 → 자동으로 QR 조각찾기 화면으로 전환</w:t>
+      </w:r>
+    </w:p>
+    <w:p>
+      <w:pPr>
+        <w:pStyle w:val="Heading2"/>
+        <w:spacing w:after="150" w:before="300"/>
+      </w:pPr>
+      <w:r>
+        <w:t xml:space="preserve">4-6. QR 조각찾기 화면</w:t>
       </w:r>
     </w:p>
     <w:p>
@@ -2131,7 +2220,7 @@
           <w:sz w:val="21"/>
           <w:szCs w:val="21"/>
         </w:rPr>
-        <w:t xml:space="preserve">개인 화면은 로그인된 직급별로 각자 진입 → 그림 업로드 → 디자인 요소·TPO·5R 선택 폼 → 이유 textarea → 제출 (이름 입력 없음, 직급으로 구분)</w:t>
+        <w:t xml:space="preserve">진입 시 '부서 이름을 입력하세요' 안내가 표시된다 (팀당 기기 1대 전제 — 여러 기기를 쓰는 경우 부서 이름+조각 번호 조합으로 확장 권장)</w:t>
       </w:r>
     </w:p>
     <w:p>
@@ -2148,7 +2237,58 @@
           <w:sz w:val="21"/>
           <w:szCs w:val="21"/>
         </w:rPr>
-        <w:t xml:space="preserve">소감 화면: 텍스트 입력 2문항 → 제출 시 결과 화면으로 이동</w:t>
+        <w:t xml:space="preserve">QR은 전부 동일 URL. 스캔하면 현재 세션의 부서 로그인 정보를 읽어 그 부서 전용 암호 입력창을 띄운다</w:t>
+      </w:r>
+    </w:p>
+    <w:p>
+      <w:pPr>
+        <w:pStyle w:val="ListParagraph"/>
+        <w:numPr>
+          <w:ilvl w:val="0"/>
+          <w:numId w:val="1"/>
+        </w:numPr>
+        <w:spacing w:after="80" w:line="276"/>
+      </w:pPr>
+      <w:r>
+        <w:rPr>
+          <w:sz w:val="21"/>
+          <w:szCs w:val="21"/>
+        </w:rPr>
+        <w:t xml:space="preserve">입력한 암호가 그 부서에 배정된 조각과 일치하면 잠금 해제 애니메이션 → pieces 문서 업데이트</w:t>
+      </w:r>
+    </w:p>
+    <w:p>
+      <w:pPr>
+        <w:pStyle w:val="ListParagraph"/>
+        <w:numPr>
+          <w:ilvl w:val="0"/>
+          <w:numId w:val="1"/>
+        </w:numPr>
+        <w:spacing w:after="80" w:line="276"/>
+      </w:pPr>
+      <w:r>
+        <w:rPr>
+          <w:sz w:val="21"/>
+          <w:szCs w:val="21"/>
+        </w:rPr>
+        <w:t xml:space="preserve">다른 부서 조각 QR을 스캔한 경우 '이건 우리 조각이 아니에요' 안내 후 화면을 닫고 다른 QR을 찾도록 유도</w:t>
+      </w:r>
+    </w:p>
+    <w:p>
+      <w:pPr>
+        <w:pStyle w:val="ListParagraph"/>
+        <w:numPr>
+          <w:ilvl w:val="0"/>
+          <w:numId w:val="1"/>
+        </w:numPr>
+        <w:spacing w:after="80" w:line="276"/>
+      </w:pPr>
+      <w:r>
+        <w:rPr>
+          <w:sz w:val="21"/>
+          <w:szCs w:val="21"/>
+        </w:rPr>
+        <w:t xml:space="preserve">조각을 찾을 때까지 이 화면에 머무르며, 해제되면 '학급 전체 진행 상황 보기' 버튼으로 대시보드 미리보기를 확인할 수 있다</w:t>
       </w:r>
     </w:p>
     <w:p>
@@ -2157,7 +2297,110 @@
         <w:spacing w:after="150" w:before="300"/>
       </w:pPr>
       <w:r>
-        <w:t xml:space="preserve">4-6. AI 그림 분석 플로우 (개인 화면 보조 기능)</w:t>
+        <w:t xml:space="preserve">4-7. 교사용 대시보드 — 조각 합성 연출</w:t>
+      </w:r>
+    </w:p>
+    <w:p>
+      <w:pPr>
+        <w:pStyle w:val="ListParagraph"/>
+        <w:numPr>
+          <w:ilvl w:val="0"/>
+          <w:numId w:val="1"/>
+        </w:numPr>
+        <w:spacing w:after="80" w:line="276"/>
+      </w:pPr>
+      <w:r>
+        <w:rPr>
+          <w:sz w:val="21"/>
+          <w:szCs w:val="21"/>
+        </w:rPr>
+        <w:t xml:space="preserve">세로줄무늬 슬롯 N개(부서 수만큼)를 나란히 배치, 각 슬롯은 해당 pieces 문서의 잠금해제여부를 구독</w:t>
+      </w:r>
+    </w:p>
+    <w:p>
+      <w:pPr>
+        <w:pStyle w:val="ListParagraph"/>
+        <w:numPr>
+          <w:ilvl w:val="0"/>
+          <w:numId w:val="1"/>
+        </w:numPr>
+        <w:spacing w:after="80" w:line="276"/>
+      </w:pPr>
+      <w:r>
+        <w:rPr>
+          <w:sz w:val="21"/>
+          <w:szCs w:val="21"/>
+        </w:rPr>
+        <w:t xml:space="preserve">잠금 해제되는 슬롯마다 해당 조각 이미지가 fade-in되며 채워짐</w:t>
+      </w:r>
+    </w:p>
+    <w:p>
+      <w:pPr>
+        <w:pStyle w:val="ListParagraph"/>
+        <w:numPr>
+          <w:ilvl w:val="0"/>
+          <w:numId w:val="1"/>
+        </w:numPr>
+        <w:spacing w:after="80" w:line="276"/>
+      </w:pPr>
+      <w:r>
+        <w:rPr>
+          <w:sz w:val="21"/>
+          <w:szCs w:val="21"/>
+        </w:rPr>
+        <w:t xml:space="preserve">마지막 슬롯이 채워지는 순간 전체 이미지에 살짝 확대(scale) 애니메이션을 주고, 한서연 메시지 카드를 그 아래 표시 (게이지 구간별 3종 메시지, 제작 가이드 7-4 참고)</w:t>
+      </w:r>
+    </w:p>
+    <w:p>
+      <w:pPr>
+        <w:pStyle w:val="Heading2"/>
+        <w:spacing w:after="150" w:before="300"/>
+      </w:pPr>
+      <w:r>
+        <w:t xml:space="preserve">4-8. 개인 디자인·소감 화면</w:t>
+      </w:r>
+    </w:p>
+    <w:p>
+      <w:pPr>
+        <w:pStyle w:val="ListParagraph"/>
+        <w:numPr>
+          <w:ilvl w:val="0"/>
+          <w:numId w:val="1"/>
+        </w:numPr>
+        <w:spacing w:after="80" w:line="276"/>
+      </w:pPr>
+      <w:r>
+        <w:rPr>
+          <w:sz w:val="21"/>
+          <w:szCs w:val="21"/>
+        </w:rPr>
+        <w:t xml:space="preserve">개인 화면은 로그인된 직급별로 각자 진입 → 그림 업로드 → 디자인 요소·TPO·5R 선택 폼 → 이유 textarea → 제출 (이름 입력 없음, 직급으로 구분)</w:t>
+      </w:r>
+    </w:p>
+    <w:p>
+      <w:pPr>
+        <w:pStyle w:val="ListParagraph"/>
+        <w:numPr>
+          <w:ilvl w:val="0"/>
+          <w:numId w:val="1"/>
+        </w:numPr>
+        <w:spacing w:after="80" w:line="276"/>
+      </w:pPr>
+      <w:r>
+        <w:rPr>
+          <w:sz w:val="21"/>
+          <w:szCs w:val="21"/>
+        </w:rPr>
+        <w:t xml:space="preserve">소감 화면: 텍스트 입력 2문항 → 제출 시 결과 화면으로 이동</w:t>
+      </w:r>
+    </w:p>
+    <w:p>
+      <w:pPr>
+        <w:pStyle w:val="Heading2"/>
+        <w:spacing w:after="150" w:before="300"/>
+      </w:pPr>
+      <w:r>
+        <w:t xml:space="preserve">4-9. AI 그림 분석 플로우 (개인 화면 보조 기능)</w:t>
       </w:r>
     </w:p>
     <w:tbl>
@@ -3443,6 +3686,86 @@
                 <w:szCs w:val="20"/>
               </w:rPr>
               <w:t xml:space="preserve">개인 소감 제출</w:t>
+            </w:r>
+          </w:p>
+        </w:tc>
+      </w:tr>
+      <w:tr>
+        <w:tc>
+          <w:tcPr>
+            <w:tcW w:type="dxa" w:w="2400"/>
+            <w:tcMar>
+              <w:top w:type="dxa" w:w="100"/>
+              <w:left w:type="dxa" w:w="120"/>
+              <w:bottom w:type="dxa" w:w="100"/>
+              <w:right w:type="dxa" w:w="120"/>
+            </w:tcMar>
+            <w:vAlign w:val="center"/>
+          </w:tcPr>
+          <w:p>
+            <w:pPr>
+              <w:jc w:val="left"/>
+            </w:pPr>
+            <w:r>
+              <w:rPr>
+                <w:b w:val="false"/>
+                <w:bCs w:val="false"/>
+                <w:sz w:val="20"/>
+                <w:szCs w:val="20"/>
+              </w:rPr>
+              <w:t xml:space="preserve">pieces/{조각번호}</w:t>
+            </w:r>
+          </w:p>
+        </w:tc>
+        <w:tc>
+          <w:tcPr>
+            <w:tcW w:type="dxa" w:w="2200"/>
+            <w:tcMar>
+              <w:top w:type="dxa" w:w="100"/>
+              <w:left w:type="dxa" w:w="120"/>
+              <w:bottom w:type="dxa" w:w="100"/>
+              <w:right w:type="dxa" w:w="120"/>
+            </w:tcMar>
+            <w:vAlign w:val="center"/>
+          </w:tcPr>
+          <w:p>
+            <w:pPr>
+              <w:jc w:val="left"/>
+            </w:pPr>
+            <w:r>
+              <w:rPr>
+                <w:b w:val="false"/>
+                <w:bCs w:val="false"/>
+                <w:sz w:val="20"/>
+                <w:szCs w:val="20"/>
+              </w:rPr>
+              <w:t xml:space="preserve">담당부서ID · imageUrl · 잠금해제여부 · 해제시각</w:t>
+            </w:r>
+          </w:p>
+        </w:tc>
+        <w:tc>
+          <w:tcPr>
+            <w:tcW w:type="dxa" w:w="4426"/>
+            <w:tcMar>
+              <w:top w:type="dxa" w:w="100"/>
+              <w:left w:type="dxa" w:w="120"/>
+              <w:bottom w:type="dxa" w:w="100"/>
+              <w:right w:type="dxa" w:w="120"/>
+            </w:tcMar>
+            <w:vAlign w:val="center"/>
+          </w:tcPr>
+          <w:p>
+            <w:pPr>
+              <w:jc w:val="left"/>
+            </w:pPr>
+            <w:r>
+              <w:rPr>
+                <w:b w:val="false"/>
+                <w:bCs w:val="false"/>
+                <w:sz w:val="20"/>
+                <w:szCs w:val="20"/>
+              </w:rPr>
+              <w:t xml:space="preserve">QR 조각 마스터 — 부서 수만큼 사전 생성</w:t>
             </w:r>
           </w:p>
         </w:tc>

</xml_diff>